<commit_message>
docs: clarify private checkpoint delivery
</commit_message>
<xml_diff>
--- a/docs/NanoLoop_Agent_协同开发规格与接口总文档_v4.0.docx
+++ b/docs/NanoLoop_Agent_协同开发规格与接口总文档_v4.0.docx
@@ -6732,6 +6732,151 @@
     </w:p>
     <w:p>
       <w:pPr>
+        <w:pStyle w:val="BlockText"/>
+        <w:widowControl/>
+      </w:pPr>
+      <w:r>
+        <w:rPr>
+          <w:bCs/>
+          <w:rFonts w:ascii="Arial" w:hAnsi="Arial" w:eastAsia="Hiragino Sans GB" w:cs="Arial"/>
+          <w:b/>
+          <w:lang w:val="zh-CN" w:eastAsia="zh-CN"/>
+        </w:rPr>
+        <w:t xml:space="preserve">重要勘误：外部交付不等于不用交付。</w:t>
+      </w:r>
+      <w:r>
+        <w:rPr>
+          <w:rFonts w:ascii="Arial" w:hAnsi="Arial" w:eastAsia="Hiragino Sans GB" w:cs="Arial"/>
+          <w:lang w:val="zh-CN" w:eastAsia="zh-CN"/>
+        </w:rPr>
+        <w:t xml:space="preserve"> </w:t>
+      </w:r>
+      <w:r>
+        <w:rPr>
+          <w:rFonts w:ascii="Arial" w:hAnsi="Arial" w:eastAsia="Hiragino Sans GB" w:cs="Arial"/>
+          <w:lang w:val="zh-CN" w:eastAsia="zh-CN"/>
+        </w:rPr>
+        <w:t xml:space="preserve">本节只限制公开仓库的</w:t>
+      </w:r>
+      <w:r>
+        <w:rPr>
+          <w:rFonts w:ascii="Arial" w:hAnsi="Arial" w:eastAsia="Hiragino Sans GB" w:cs="Arial"/>
+          <w:lang w:val="zh-CN" w:eastAsia="zh-CN"/>
+        </w:rPr>
+        <w:t xml:space="preserve"> </w:t>
+      </w:r>
+      <w:r>
+        <w:rPr>
+          <w:rStyle w:val="VerbatimChar"/>
+        </w:rPr>
+        <w:t xml:space="preserve">commit</w:t>
+      </w:r>
+      <w:r>
+        <w:rPr>
+          <w:rFonts w:ascii="Arial" w:hAnsi="Arial" w:eastAsia="Hiragino Sans GB" w:cs="Arial"/>
+          <w:lang w:val="zh-CN" w:eastAsia="zh-CN"/>
+        </w:rPr>
+        <w:t xml:space="preserve"> </w:t>
+      </w:r>
+      <w:r>
+        <w:rPr>
+          <w:rFonts w:ascii="Arial" w:hAnsi="Arial" w:eastAsia="Hiragino Sans GB" w:cs="Arial"/>
+          <w:lang w:val="zh-CN" w:eastAsia="zh-CN"/>
+        </w:rPr>
+        <w:t xml:space="preserve">/</w:t>
+      </w:r>
+      <w:r>
+        <w:rPr>
+          <w:rFonts w:ascii="Arial" w:hAnsi="Arial" w:eastAsia="Hiragino Sans GB" w:cs="Arial"/>
+          <w:lang w:val="zh-CN" w:eastAsia="zh-CN"/>
+        </w:rPr>
+        <w:t xml:space="preserve"> </w:t>
+      </w:r>
+      <w:r>
+        <w:rPr>
+          <w:rStyle w:val="VerbatimChar"/>
+        </w:rPr>
+        <w:t xml:space="preserve">push</w:t>
+      </w:r>
+      <w:r>
+        <w:rPr>
+          <w:rFonts w:ascii="Arial" w:hAnsi="Arial" w:eastAsia="Hiragino Sans GB" w:cs="Arial"/>
+          <w:lang w:val="zh-CN" w:eastAsia="zh-CN"/>
+        </w:rPr>
+        <w:t xml:space="preserve"> </w:t>
+      </w:r>
+      <w:r>
+        <w:rPr>
+          <w:rFonts w:ascii="Arial" w:hAnsi="Arial" w:eastAsia="Hiragino Sans GB" w:cs="Arial"/>
+          <w:lang w:val="zh-CN" w:eastAsia="zh-CN"/>
+        </w:rPr>
+        <w:t xml:space="preserve">范围。</w:t>
+      </w:r>
+      <w:r>
+        <w:rPr>
+          <w:rFonts w:ascii="Arial" w:hAnsi="Arial" w:eastAsia="Hiragino Sans GB" w:cs="Arial"/>
+          <w:lang w:val="zh-CN" w:eastAsia="zh-CN"/>
+        </w:rPr>
+        <w:t xml:space="preserve"> </w:t>
+      </w:r>
+      <w:r>
+        <w:rPr>
+          <w:rFonts w:ascii="Arial" w:hAnsi="Arial" w:eastAsia="Hiragino Sans GB" w:cs="Arial"/>
+          <w:lang w:val="zh-CN" w:eastAsia="zh-CN"/>
+        </w:rPr>
+        <w:t xml:space="preserve">模型 checkpoint / 可部署权重仍是 A 模块的必交资产，必须通过私有服务器、受控网盘或线下介质</w:t>
+      </w:r>
+      <w:r>
+        <w:rPr>
+          <w:rFonts w:ascii="Arial" w:hAnsi="Arial" w:eastAsia="Hiragino Sans GB" w:cs="Arial"/>
+          <w:lang w:val="zh-CN" w:eastAsia="zh-CN"/>
+        </w:rPr>
+        <w:t xml:space="preserve"> </w:t>
+      </w:r>
+      <w:r>
+        <w:rPr>
+          <w:rFonts w:ascii="Arial" w:hAnsi="Arial" w:eastAsia="Hiragino Sans GB" w:cs="Arial"/>
+          <w:lang w:val="zh-CN" w:eastAsia="zh-CN"/>
+        </w:rPr>
+        <w:t xml:space="preserve">实际交给项目负责人；至少同时提供文件 SHA-256、config、model card、许可、数据 split / GT、</w:t>
+      </w:r>
+      <w:r>
+        <w:rPr>
+          <w:rFonts w:ascii="Arial" w:hAnsi="Arial" w:eastAsia="Hiragino Sans GB" w:cs="Arial"/>
+          <w:lang w:val="zh-CN" w:eastAsia="zh-CN"/>
+        </w:rPr>
+        <w:t xml:space="preserve"> </w:t>
+      </w:r>
+      <w:r>
+        <w:rPr>
+          <w:rFonts w:ascii="Arial" w:hAnsi="Arial" w:eastAsia="Hiragino Sans GB" w:cs="Arial"/>
+          <w:lang w:val="zh-CN" w:eastAsia="zh-CN"/>
+        </w:rPr>
+        <w:t xml:space="preserve">运行环境和真实 smoke 证据。项目负责人尚未收到并复核这些资产时，公开 registry 必须保持</w:t>
+      </w:r>
+      <w:r>
+        <w:rPr>
+          <w:rFonts w:ascii="Arial" w:hAnsi="Arial" w:eastAsia="Hiragino Sans GB" w:cs="Arial"/>
+          <w:lang w:val="zh-CN" w:eastAsia="zh-CN"/>
+        </w:rPr>
+        <w:t xml:space="preserve"> </w:t>
+      </w:r>
+      <w:r>
+        <w:rPr>
+          <w:rStyle w:val="VerbatimChar"/>
+        </w:rPr>
+        <w:t xml:space="preserve">unavailable</w:t>
+      </w:r>
+      <w:r>
+        <w:rPr>
+          <w:rFonts w:ascii="Arial" w:hAnsi="Arial" w:eastAsia="Hiragino Sans GB" w:cs="Arial"/>
+          <w:lang w:val="zh-CN" w:eastAsia="zh-CN"/>
+        </w:rPr>
+        <w:t xml:space="preserve">。</w:t>
+      </w:r>
+    </w:p>
+    <w:p>
+      <w:pPr>
         <w:widowControl/>
         <w:numPr>
           <w:ilvl w:val="0"/>
@@ -8377,6 +8522,33 @@
           <w:rFonts w:ascii="Arial" w:hAnsi="Arial" w:eastAsia="Hiragino Sans GB" w:cs="Arial"/>
           <w:lang w:val="zh-CN" w:eastAsia="zh-CN"/>
         </w:rPr>
+        <w:t xml:space="preserve">这里的 checkpoint 必须实际交给项目，不是只写一个路径或哈希。Git 只保存其身份摘要和验收记录，</w:t>
+      </w:r>
+      <w:r>
+        <w:rPr>
+          <w:rFonts w:ascii="Arial" w:hAnsi="Arial" w:eastAsia="Hiragino Sans GB" w:cs="Arial"/>
+          <w:lang w:val="zh-CN" w:eastAsia="zh-CN"/>
+        </w:rPr>
+        <w:t xml:space="preserve"> </w:t>
+      </w:r>
+      <w:r>
+        <w:rPr>
+          <w:rFonts w:ascii="Arial" w:hAnsi="Arial" w:eastAsia="Hiragino Sans GB" w:cs="Arial"/>
+          <w:lang w:val="zh-CN" w:eastAsia="zh-CN"/>
+        </w:rPr>
+        <w:t xml:space="preserve">二进制文件通过受控外部渠道交付。</w:t>
+      </w:r>
+    </w:p>
+    <w:p>
+      <w:pPr>
+        <w:pStyle w:val="BodyText"/>
+        <w:widowControl/>
+      </w:pPr>
+      <w:r>
+        <w:rPr>
+          <w:rFonts w:ascii="Arial" w:hAnsi="Arial" w:eastAsia="Hiragino Sans GB" w:cs="Arial"/>
+          <w:lang w:val="zh-CN" w:eastAsia="zh-CN"/>
+        </w:rPr>
         <w:t xml:space="preserve">输出采用以下外部包；包放私有服务器或受控存储，Git 只提交 schema、校验代码和不泄密的摘要。</w:t>
       </w:r>
     </w:p>
@@ -8868,7 +9040,69 @@
           <w:rFonts w:ascii="Arial" w:hAnsi="Arial" w:eastAsia="Hiragino Sans GB" w:cs="Arial"/>
           <w:lang w:val="zh-CN" w:eastAsia="zh-CN"/>
         </w:rPr>
-        <w:t xml:space="preserve">一个真实模型身份完整：权重/配置/卡/Adapter SHA、许可、版本和运行环境可核对。</w:t>
+        <w:t xml:space="preserve">项目负责人已实际取得可部署</w:t>
+      </w:r>
+      <w:r>
+        <w:rPr>
+          <w:rFonts w:ascii="Arial" w:hAnsi="Arial" w:eastAsia="Hiragino Sans GB" w:cs="Arial"/>
+          <w:lang w:val="zh-CN" w:eastAsia="zh-CN"/>
+        </w:rPr>
+        <w:t xml:space="preserve"> </w:t>
+      </w:r>
+      <w:r>
+        <w:rPr>
+          <w:rStyle w:val="VerbatimChar"/>
+        </w:rPr>
+        <w:t xml:space="preserve">.pt</w:t>
+      </w:r>
+      <w:r>
+        <w:rPr>
+          <w:rFonts w:ascii="Arial" w:hAnsi="Arial" w:eastAsia="Hiragino Sans GB" w:cs="Arial"/>
+          <w:lang w:val="zh-CN" w:eastAsia="zh-CN"/>
+        </w:rPr>
+        <w:t xml:space="preserve">、资产清单和配套材料并核对 SHA-256；只有模型卡中的哈希、</w:t>
+      </w:r>
+      <w:r>
+        <w:rPr>
+          <w:rFonts w:ascii="Arial" w:hAnsi="Arial" w:eastAsia="Hiragino Sans GB" w:cs="Arial"/>
+          <w:lang w:val="zh-CN" w:eastAsia="zh-CN"/>
+        </w:rPr>
+        <w:t xml:space="preserve"> </w:t>
+      </w:r>
+      <w:r>
+        <w:rPr>
+          <w:rFonts w:ascii="Arial" w:hAnsi="Arial" w:eastAsia="Hiragino Sans GB" w:cs="Arial"/>
+          <w:lang w:val="zh-CN" w:eastAsia="zh-CN"/>
+        </w:rPr>
+        <w:t xml:space="preserve">本机路径或</w:t>
+      </w:r>
+      <w:r>
+        <w:rPr>
+          <w:rFonts w:ascii="Arial" w:hAnsi="Arial" w:eastAsia="Hiragino Sans GB" w:cs="Arial"/>
+          <w:lang w:val="zh-CN" w:eastAsia="zh-CN"/>
+        </w:rPr>
+        <w:t xml:space="preserve">“</w:t>
+      </w:r>
+      <w:r>
+        <w:rPr>
+          <w:rFonts w:ascii="Arial" w:hAnsi="Arial" w:eastAsia="Hiragino Sans GB" w:cs="Arial"/>
+          <w:lang w:val="zh-CN" w:eastAsia="zh-CN"/>
+        </w:rPr>
+        <w:t xml:space="preserve">本机可运行</w:t>
+      </w:r>
+      <w:r>
+        <w:rPr>
+          <w:rFonts w:ascii="Arial" w:hAnsi="Arial" w:eastAsia="Hiragino Sans GB" w:cs="Arial"/>
+          <w:lang w:val="zh-CN" w:eastAsia="zh-CN"/>
+        </w:rPr>
+        <w:t xml:space="preserve">”</w:t>
+      </w:r>
+      <w:r>
+        <w:rPr>
+          <w:rFonts w:ascii="Arial" w:hAnsi="Arial" w:eastAsia="Hiragino Sans GB" w:cs="Arial"/>
+          <w:lang w:val="zh-CN" w:eastAsia="zh-CN"/>
+        </w:rPr>
+        <w:t xml:space="preserve">说明不算交付。</w:t>
       </w:r>
     </w:p>
     <w:p>
@@ -8885,7 +9119,7 @@
           <w:rFonts w:ascii="Arial" w:hAnsi="Arial" w:eastAsia="Hiragino Sans GB" w:cs="Arial"/>
           <w:lang w:val="zh-CN" w:eastAsia="zh-CN"/>
         </w:rPr>
-        <w:t xml:space="preserve">独立测试集由人工 GT 支撑，指标不是聊天截图或训练集结果。</w:t>
+        <w:t xml:space="preserve">一个真实模型身份完整：权重/配置/卡/Adapter SHA、许可、版本和运行环境可核对。</w:t>
       </w:r>
     </w:p>
     <w:p>
@@ -8902,27 +9136,7 @@
           <w:rFonts w:ascii="Arial" w:hAnsi="Arial" w:eastAsia="Hiragino Sans GB" w:cs="Arial"/>
           <w:lang w:val="zh-CN" w:eastAsia="zh-CN"/>
         </w:rPr>
-        <w:t xml:space="preserve">目标设备真实推理成功，最终验收没有</w:t>
-      </w:r>
-      <w:r>
-        <w:rPr>
-          <w:rFonts w:ascii="Arial" w:hAnsi="Arial" w:eastAsia="Hiragino Sans GB" w:cs="Arial"/>
-          <w:lang w:val="zh-CN" w:eastAsia="zh-CN"/>
-        </w:rPr>
-        <w:t xml:space="preserve"> </w:t>
-      </w:r>
-      <w:r>
-        <w:rPr>
-          <w:rStyle w:val="VerbatimChar"/>
-        </w:rPr>
-        <w:t xml:space="preserve">--allow-degraded</w:t>
-      </w:r>
-      <w:r>
-        <w:rPr>
-          <w:rFonts w:ascii="Arial" w:hAnsi="Arial" w:eastAsia="Hiragino Sans GB" w:cs="Arial"/>
-          <w:lang w:val="zh-CN" w:eastAsia="zh-CN"/>
-        </w:rPr>
-        <w:t xml:space="preserve">。</w:t>
+        <w:t xml:space="preserve">独立测试集由人工 GT 支撑，指标不是聊天截图或训练集结果。</w:t>
       </w:r>
     </w:p>
     <w:p>
@@ -8939,7 +9153,7 @@
           <w:rFonts w:ascii="Arial" w:hAnsi="Arial" w:eastAsia="Hiragino Sans GB" w:cs="Arial"/>
           <w:lang w:val="zh-CN" w:eastAsia="zh-CN"/>
         </w:rPr>
-        <w:t xml:space="preserve">canonical</w:t>
+        <w:t xml:space="preserve">目标设备真实推理成功，最终验收没有</w:t>
       </w:r>
       <w:r>
         <w:rPr>
@@ -8952,27 +9166,14 @@
         <w:rPr>
           <w:rStyle w:val="VerbatimChar"/>
         </w:rPr>
-        <w:t xml:space="preserve">pred_mask.png</w:t>
-      </w:r>
-      <w:r>
-        <w:rPr>
-          <w:rFonts w:ascii="Arial" w:hAnsi="Arial" w:eastAsia="Hiragino Sans GB" w:cs="Arial"/>
-          <w:lang w:val="zh-CN" w:eastAsia="zh-CN"/>
-        </w:rPr>
-        <w:t xml:space="preserve">、</w:t>
-      </w:r>
-      <w:r>
-        <w:rPr>
-          <w:rStyle w:val="VerbatimChar"/>
-        </w:rPr>
-        <w:t xml:space="preserve">instances.json</w:t>
-      </w:r>
-      <w:r>
-        <w:rPr>
-          <w:rFonts w:ascii="Arial" w:hAnsi="Arial" w:eastAsia="Hiragino Sans GB" w:cs="Arial"/>
-          <w:lang w:val="zh-CN" w:eastAsia="zh-CN"/>
-        </w:rPr>
-        <w:t xml:space="preserve">、颗粒表、统计、overlay 和报告彼此一致。</w:t>
+        <w:t xml:space="preserve">--allow-degraded</w:t>
+      </w:r>
+      <w:r>
+        <w:rPr>
+          <w:rFonts w:ascii="Arial" w:hAnsi="Arial" w:eastAsia="Hiragino Sans GB" w:cs="Arial"/>
+          <w:lang w:val="zh-CN" w:eastAsia="zh-CN"/>
+        </w:rPr>
+        <w:t xml:space="preserve">。</w:t>
       </w:r>
     </w:p>
     <w:p>
@@ -8989,7 +9190,40 @@
           <w:rFonts w:ascii="Arial" w:hAnsi="Arial" w:eastAsia="Hiragino Sans GB" w:cs="Arial"/>
           <w:lang w:val="zh-CN" w:eastAsia="zh-CN"/>
         </w:rPr>
-        <w:t xml:space="preserve">团聚区域无法可靠拆分时明确限制，不把整体团聚块包装成精确单颗粒结果。</w:t>
+        <w:t xml:space="preserve">canonical</w:t>
+      </w:r>
+      <w:r>
+        <w:rPr>
+          <w:rFonts w:ascii="Arial" w:hAnsi="Arial" w:eastAsia="Hiragino Sans GB" w:cs="Arial"/>
+          <w:lang w:val="zh-CN" w:eastAsia="zh-CN"/>
+        </w:rPr>
+        <w:t xml:space="preserve"> </w:t>
+      </w:r>
+      <w:r>
+        <w:rPr>
+          <w:rStyle w:val="VerbatimChar"/>
+        </w:rPr>
+        <w:t xml:space="preserve">pred_mask.png</w:t>
+      </w:r>
+      <w:r>
+        <w:rPr>
+          <w:rFonts w:ascii="Arial" w:hAnsi="Arial" w:eastAsia="Hiragino Sans GB" w:cs="Arial"/>
+          <w:lang w:val="zh-CN" w:eastAsia="zh-CN"/>
+        </w:rPr>
+        <w:t xml:space="preserve">、</w:t>
+      </w:r>
+      <w:r>
+        <w:rPr>
+          <w:rStyle w:val="VerbatimChar"/>
+        </w:rPr>
+        <w:t xml:space="preserve">instances.json</w:t>
+      </w:r>
+      <w:r>
+        <w:rPr>
+          <w:rFonts w:ascii="Arial" w:hAnsi="Arial" w:eastAsia="Hiragino Sans GB" w:cs="Arial"/>
+          <w:lang w:val="zh-CN" w:eastAsia="zh-CN"/>
+        </w:rPr>
+        <w:t xml:space="preserve">、颗粒表、统计、overlay 和报告彼此一致。</w:t>
       </w:r>
     </w:p>
     <w:p>
@@ -9006,6 +9240,23 @@
           <w:rFonts w:ascii="Arial" w:hAnsi="Arial" w:eastAsia="Hiragino Sans GB" w:cs="Arial"/>
           <w:lang w:val="zh-CN" w:eastAsia="zh-CN"/>
         </w:rPr>
+        <w:t xml:space="preserve">团聚区域无法可靠拆分时明确限制，不把整体团聚块包装成精确单颗粒结果。</w:t>
+      </w:r>
+    </w:p>
+    <w:p>
+      <w:pPr>
+        <w:widowControl/>
+        <w:numPr>
+          <w:ilvl w:val="0"/>
+          <w:numId w:val="1007"/>
+        </w:numPr>
+        <w:pStyle w:val="Compact"/>
+      </w:pPr>
+      <w:r>
+        <w:rPr>
+          <w:rFonts w:ascii="Arial" w:hAnsi="Arial" w:eastAsia="Hiragino Sans GB" w:cs="Arial"/>
+          <w:lang w:val="zh-CN" w:eastAsia="zh-CN"/>
+        </w:rPr>
         <w:t xml:space="preserve">交付真实资产包、运行记录、失败案例；必要代码通过 inference/analysis 窄测试和公共门禁。</w:t>
       </w:r>
     </w:p>
@@ -9266,7 +9517,7 @@
           <w:sz w:val="16"/>
           <w:lang w:val="zh-CN" w:eastAsia="zh-CN"/>
         </w:rPr>
-        <w:t xml:space="preserve">3. 权重、原图、GT、索引、秘密不进入公开 Git；公开 registry 不伪装 ready。</w:t>
+        <w:t xml:space="preserve">3. 权重、原图、GT、索引、秘密不进入公开 Git，但必须按资产包要求通过受控渠道实际交付；公开 registry 不伪装 ready。</w:t>
       </w:r>
       <w:r>
         <w:rPr>
@@ -13826,7 +14077,7 @@
           <w:sz w:val="16"/>
           <w:lang w:val="zh-CN" w:eastAsia="zh-CN"/>
         </w:rPr>
-        <w:t xml:space="preserve">本批目标：在不提交权重/语料/索引/秘密的前提下，以只读外部挂载接收 A+B 与 D 的验收包，</w:t>
+        <w:t xml:space="preserve">本批目标：在不把权重/语料/索引/秘密提交到公开 Git、而通过只读外部挂载实际交付它们的前提下，接收 A+B 与 D 的验收包，</w:t>
       </w:r>
       <w:r>
         <w:rPr>

</xml_diff>